<commit_message>
Add study guides for lessons 2-9 to 2-12; apply batch 2 review fixes
Co-Authored-By: Claude Opus 5.5 <noreply@anthropic.com>
</commit_message>
<xml_diff>
--- a/docs/study-guides/chapter-2/word/Lesson-2-05-Addition-Patterns.docx
+++ b/docs/study-guides/chapter-2/word/Lesson-2-05-Addition-Patterns.docx
@@ -2762,7 +2762,7 @@
                 <w:sz w:val="28"/>
                 <w:szCs w:val="28"/>
               </w:rPr>
-              <w:t xml:space="preserve">odd + odd = ________</w:t>
+              <w:t xml:space="preserve">________ = odd + odd</w:t>
             </w:r>
           </w:p>
           <w:p>
@@ -3745,7 +3745,7 @@
                 <w:sz w:val="21"/>
                 <w:szCs w:val="21"/>
               </w:rPr>
-              <w:t xml:space="preserve">. Samples: 214 + 133 = 347; 405 + 122 = 527</w:t>
+              <w:t xml:space="preserve">. Samples: 347 = 133 + 214; 527 = 405 + 122</w:t>
             </w:r>
           </w:p>
           <w:p>

</xml_diff>